<commit_message>
feat: add NPR and GMR document templates to project directory
</commit_message>
<xml_diff>
--- a/DOC's/GMR.docx
+++ b/DOC's/GMR.docx
@@ -219,6 +219,14 @@
         <w:tblStyle w:val="TableGrid"/>
         <w:tblpPr w:leftFromText="180" w:rightFromText="180" w:vertAnchor="text" w:horzAnchor="page" w:tblpX="7223" w:tblpY="273"/>
         <w:tblW w:w="0" w:type="auto"/>
+        <w:tblBorders>
+          <w:top w:val="none" w:sz="0" w:space="0" w:color="auto"/>
+          <w:left w:val="none" w:sz="0" w:space="0" w:color="auto"/>
+          <w:bottom w:val="none" w:sz="0" w:space="0" w:color="auto"/>
+          <w:right w:val="none" w:sz="0" w:space="0" w:color="auto"/>
+          <w:insideH w:val="none" w:sz="0" w:space="0" w:color="auto"/>
+          <w:insideV w:val="none" w:sz="0" w:space="0" w:color="auto"/>
+        </w:tblBorders>
         <w:tblLook w:val="04A0" w:firstRow="1" w:lastRow="0" w:firstColumn="1" w:lastColumn="0" w:noHBand="0" w:noVBand="1"/>
       </w:tblPr>
       <w:tblGrid>
@@ -239,13 +247,7 @@
               </w:rPr>
             </w:pPr>
             <w:r>
-              <w:t>{{%QR_CODE_</w:t>
-            </w:r>
-            <w:r>
-              <w:t>2</w:t>
-            </w:r>
-            <w:r>
-              <w:t>}}</w:t>
+              <w:t>{{%QR_CODE_2}}</w:t>
             </w:r>
           </w:p>
         </w:tc>
@@ -633,7 +635,7 @@
     <w:lsdException w:name="Table Web 2" w:semiHidden="1" w:unhideWhenUsed="1"/>
     <w:lsdException w:name="Table Web 3" w:semiHidden="1" w:unhideWhenUsed="1"/>
     <w:lsdException w:name="Balloon Text" w:semiHidden="1" w:unhideWhenUsed="1"/>
-    <w:lsdException w:name="Table Grid" w:semiHidden="1" w:uiPriority="59" w:unhideWhenUsed="1"/>
+    <w:lsdException w:name="Table Grid" w:uiPriority="59"/>
     <w:lsdException w:name="Table Theme" w:semiHidden="1" w:unhideWhenUsed="1"/>
     <w:lsdException w:name="Placeholder Text" w:semiHidden="1"/>
     <w:lsdException w:name="No Spacing" w:uiPriority="1" w:qFormat="1"/>

</xml_diff>